<commit_message>
add: add report part 1 (#6)
</commit_message>
<xml_diff>
--- a/Project/2024.M3.BC-and-DC_project_3.docx
+++ b/Project/2024.M3.BC-and-DC_project_3.docx
@@ -8,16 +8,13 @@
         <w:spacing w:before="0" w:beforeAutospacing="0" w:after="0" w:afterAutospacing="0"/>
         <w:jc w:val="center"/>
         <w:textAlignment w:val="baseline"/>
-        <w:rPr>
-          <w:rFonts w:hint="eastAsia"/>
-        </w:rPr>
       </w:pPr>
       <w:r>
         <w:rPr>
           <w:noProof/>
         </w:rPr>
         <w:drawing>
-          <wp:inline distT="0" distB="0" distL="0" distR="0" wp14:anchorId="764DA9D5" wp14:editId="1C7959CD">
+          <wp:inline distT="0" distB="0" distL="0" distR="0" wp14:anchorId="764DA9D5" wp14:editId="6C810B67">
             <wp:extent cx="3048755" cy="881503"/>
             <wp:effectExtent l="0" t="0" r="0" b="0"/>
             <wp:docPr id="5" name="Picture 5"/>
@@ -78,14 +75,6 @@
         </w:rPr>
         <w:t>Peking University HSBC Business School (PHBS)</w:t>
       </w:r>
-    </w:p>
-    <w:p>
-      <w:pPr>
-        <w:pStyle w:val="paragraph"/>
-        <w:spacing w:before="0" w:beforeAutospacing="0" w:after="0" w:afterAutospacing="0"/>
-        <w:jc w:val="center"/>
-        <w:textAlignment w:val="baseline"/>
-      </w:pPr>
     </w:p>
     <w:p>
       <w:pPr>
@@ -795,6 +784,62 @@
         <w:jc w:val="center"/>
         <w:textAlignment w:val="baseline"/>
       </w:pPr>
+      <w:r>
+        <w:drawing>
+          <wp:inline distT="0" distB="0" distL="0" distR="0" wp14:anchorId="6F1E5C01" wp14:editId="20923E41">
+            <wp:extent cx="898473" cy="898473"/>
+            <wp:effectExtent l="0" t="0" r="3810" b="3810"/>
+            <wp:docPr id="3" name="Picture 2">
+              <a:extLst xmlns:a="http://schemas.openxmlformats.org/drawingml/2006/main">
+                <a:ext uri="{FF2B5EF4-FFF2-40B4-BE49-F238E27FC236}">
+                  <a16:creationId xmlns:a16="http://schemas.microsoft.com/office/drawing/2014/main" id="{7E6FE0FB-83D2-5148-B3A9-5AFBD96078C5}"/>
+                </a:ext>
+              </a:extLst>
+            </wp:docPr>
+            <wp:cNvGraphicFramePr>
+              <a:graphicFrameLocks xmlns:a="http://schemas.openxmlformats.org/drawingml/2006/main" noChangeAspect="1"/>
+            </wp:cNvGraphicFramePr>
+            <a:graphic xmlns:a="http://schemas.openxmlformats.org/drawingml/2006/main">
+              <a:graphicData uri="http://schemas.openxmlformats.org/drawingml/2006/picture">
+                <pic:pic xmlns:pic="http://schemas.openxmlformats.org/drawingml/2006/picture">
+                  <pic:nvPicPr>
+                    <pic:cNvPr id="3" name="Picture 2">
+                      <a:extLst>
+                        <a:ext uri="{FF2B5EF4-FFF2-40B4-BE49-F238E27FC236}">
+                          <a16:creationId xmlns:a16="http://schemas.microsoft.com/office/drawing/2014/main" id="{7E6FE0FB-83D2-5148-B3A9-5AFBD96078C5}"/>
+                        </a:ext>
+                      </a:extLst>
+                    </pic:cNvPr>
+                    <pic:cNvPicPr>
+                      <a:picLocks noChangeAspect="1"/>
+                    </pic:cNvPicPr>
+                  </pic:nvPicPr>
+                  <pic:blipFill rotWithShape="1">
+                    <a:blip r:embed="rId9" cstate="print">
+                      <a:extLst>
+                        <a:ext uri="{28A0092B-C50C-407E-A947-70E740481C1C}">
+                          <a14:useLocalDpi xmlns:a14="http://schemas.microsoft.com/office/drawing/2010/main" val="0"/>
+                        </a:ext>
+                      </a:extLst>
+                    </a:blip>
+                    <a:srcRect l="25658" t="25658" r="26199" b="26199"/>
+                    <a:stretch/>
+                  </pic:blipFill>
+                  <pic:spPr>
+                    <a:xfrm>
+                      <a:off x="0" y="0"/>
+                      <a:ext cx="898473" cy="898473"/>
+                    </a:xfrm>
+                    <a:prstGeom prst="rect">
+                      <a:avLst/>
+                    </a:prstGeom>
+                  </pic:spPr>
+                </pic:pic>
+              </a:graphicData>
+            </a:graphic>
+          </wp:inline>
+        </w:drawing>
+      </w:r>
     </w:p>
     <w:p>
       <w:pPr>
@@ -811,6 +856,48 @@
         <w:jc w:val="center"/>
         <w:textAlignment w:val="baseline"/>
       </w:pPr>
+      <w:r>
+        <w:rPr>
+          <w:rFonts w:hint="eastAsia"/>
+        </w:rPr>
+        <w:t>Block</w:t>
+      </w:r>
+      <w:r>
+        <w:t xml:space="preserve"> </w:t>
+      </w:r>
+      <w:r>
+        <w:rPr>
+          <w:rFonts w:hint="eastAsia"/>
+        </w:rPr>
+        <w:t>Chain</w:t>
+      </w:r>
+      <w:r>
+        <w:t xml:space="preserve"> </w:t>
+      </w:r>
+      <w:r>
+        <w:rPr>
+          <w:rFonts w:hint="eastAsia"/>
+        </w:rPr>
+        <w:t>and</w:t>
+      </w:r>
+      <w:r>
+        <w:t xml:space="preserve"> </w:t>
+      </w:r>
+      <w:r>
+        <w:rPr>
+          <w:rFonts w:hint="eastAsia"/>
+        </w:rPr>
+        <w:t>Digital</w:t>
+      </w:r>
+      <w:r>
+        <w:t xml:space="preserve"> </w:t>
+      </w:r>
+      <w:r>
+        <w:rPr>
+          <w:rFonts w:hint="eastAsia"/>
+        </w:rPr>
+        <w:t>Currency</w:t>
+      </w:r>
     </w:p>
     <w:p>
       <w:pPr>
@@ -818,56 +905,6 @@
         <w:spacing w:before="0" w:beforeAutospacing="0" w:after="0" w:afterAutospacing="0"/>
         <w:jc w:val="center"/>
         <w:textAlignment w:val="baseline"/>
-      </w:pPr>
-      <w:r>
-        <w:rPr>
-          <w:rFonts w:hint="eastAsia"/>
-        </w:rPr>
-        <w:t>Block</w:t>
-      </w:r>
-      <w:r>
-        <w:t xml:space="preserve"> </w:t>
-      </w:r>
-      <w:r>
-        <w:rPr>
-          <w:rFonts w:hint="eastAsia"/>
-        </w:rPr>
-        <w:t>Chain</w:t>
-      </w:r>
-      <w:r>
-        <w:t xml:space="preserve"> </w:t>
-      </w:r>
-      <w:r>
-        <w:rPr>
-          <w:rFonts w:hint="eastAsia"/>
-        </w:rPr>
-        <w:t>and</w:t>
-      </w:r>
-      <w:r>
-        <w:t xml:space="preserve"> </w:t>
-      </w:r>
-      <w:r>
-        <w:rPr>
-          <w:rFonts w:hint="eastAsia"/>
-        </w:rPr>
-        <w:t>Digital</w:t>
-      </w:r>
-      <w:r>
-        <w:t xml:space="preserve"> </w:t>
-      </w:r>
-      <w:r>
-        <w:rPr>
-          <w:rFonts w:hint="eastAsia"/>
-        </w:rPr>
-        <w:t>Currency</w:t>
-      </w:r>
-    </w:p>
-    <w:p>
-      <w:pPr>
-        <w:pStyle w:val="paragraph"/>
-        <w:spacing w:before="0" w:beforeAutospacing="0" w:after="0" w:afterAutospacing="0"/>
-        <w:jc w:val="center"/>
-        <w:textAlignment w:val="baseline"/>
         <w:rPr>
           <w:rStyle w:val="normaltextrun"/>
         </w:rPr>
@@ -876,7 +913,7 @@
         <w:rPr>
           <w:rStyle w:val="normaltextrun"/>
         </w:rPr>
-        <w:t>18</w:t>
+        <w:t>26</w:t>
       </w:r>
       <w:r>
         <w:rPr>
@@ -946,11 +983,11 @@
           <w:bCs/>
         </w:rPr>
         <w:sectPr>
-          <w:headerReference w:type="default" r:id="rId9"/>
-          <w:footerReference w:type="even" r:id="rId10"/>
-          <w:footerReference w:type="default" r:id="rId11"/>
-          <w:headerReference w:type="first" r:id="rId12"/>
-          <w:footerReference w:type="first" r:id="rId13"/>
+          <w:headerReference w:type="default" r:id="rId10"/>
+          <w:footerReference w:type="even" r:id="rId11"/>
+          <w:footerReference w:type="default" r:id="rId12"/>
+          <w:headerReference w:type="first" r:id="rId13"/>
+          <w:footerReference w:type="first" r:id="rId14"/>
           <w:type w:val="continuous"/>
           <w:pgSz w:w="11900" w:h="16840"/>
           <w:pgMar w:top="1440" w:right="1440" w:bottom="1440" w:left="1440" w:header="708" w:footer="708" w:gutter="0"/>
@@ -968,10 +1005,1709 @@
           <w:ilvl w:val="0"/>
           <w:numId w:val="0"/>
         </w:numPr>
-        <w:spacing w:before="0" w:beforeAutospacing="0" w:after="0" w:afterAutospacing="0" w:line="271" w:lineRule="auto"/>
-        <w:rPr>
-          <w:rFonts w:eastAsia="DengXian"/>
+        <w:spacing w:before="0" w:beforeAutospacing="0" w:after="0" w:afterAutospacing="0" w:line="360" w:lineRule="auto"/>
+        <w:rPr>
+          <w:sz w:val="28"/>
+          <w:szCs w:val="28"/>
+        </w:rPr>
+      </w:pPr>
+      <w:r>
+        <w:rPr>
+          <w:sz w:val="28"/>
+          <w:szCs w:val="28"/>
+        </w:rPr>
+        <w:lastRenderedPageBreak/>
+        <w:t>1</w:t>
+      </w:r>
+      <w:r>
+        <w:rPr>
+          <w:sz w:val="28"/>
+          <w:szCs w:val="28"/>
+        </w:rPr>
+        <w:t xml:space="preserve">. </w:t>
+      </w:r>
+      <w:r>
+        <w:rPr>
+          <w:rFonts w:hint="eastAsia"/>
+          <w:sz w:val="28"/>
+          <w:szCs w:val="28"/>
+        </w:rPr>
+        <w:t>In</w:t>
+      </w:r>
+      <w:r>
+        <w:rPr>
+          <w:sz w:val="28"/>
+          <w:szCs w:val="28"/>
+        </w:rPr>
+        <w:t>troduction</w:t>
+      </w:r>
+    </w:p>
+    <w:p>
+      <w:pPr>
+        <w:spacing w:line="360" w:lineRule="auto"/>
+        <w:ind w:firstLine="420"/>
+        <w:jc w:val="both"/>
+        <w:rPr>
+          <w:rFonts w:eastAsia="DengXian" w:hint="eastAsia"/>
+        </w:rPr>
+      </w:pPr>
+      <w:r>
+        <w:rPr>
+          <w:rFonts w:eastAsia="DengXian"/>
+          <w:b/>
+          <w:bCs/>
+        </w:rPr>
+        <w:t>“Pay First</w:t>
+      </w:r>
+      <w:r>
+        <w:rPr>
+          <w:rFonts w:eastAsia="DengXian"/>
+          <w:b/>
+          <w:bCs/>
+        </w:rPr>
+        <w:t>,</w:t>
+      </w:r>
+      <w:r>
+        <w:rPr>
+          <w:rFonts w:eastAsia="DengXian"/>
+          <w:b/>
+          <w:bCs/>
+        </w:rPr>
+        <w:t xml:space="preserve"> Use Later</w:t>
+      </w:r>
+      <w:r>
+        <w:rPr>
+          <w:rFonts w:eastAsia="DengXian"/>
+          <w:b/>
+          <w:bCs/>
+          <w:lang w:val="en-US"/>
+        </w:rPr>
+        <w:t>”</w:t>
+      </w:r>
+      <w:r>
+        <w:rPr>
+          <w:rFonts w:eastAsia="DengXian"/>
+          <w:lang w:val="en-US"/>
+        </w:rPr>
+        <w:t xml:space="preserve"> </w:t>
+      </w:r>
+      <w:r>
+        <w:rPr>
+          <w:rFonts w:eastAsia="DengXian"/>
+        </w:rPr>
+        <w:t xml:space="preserve">and </w:t>
+      </w:r>
+      <w:r>
+        <w:rPr>
+          <w:rFonts w:eastAsia="DengXian"/>
+          <w:b/>
+          <w:bCs/>
+        </w:rPr>
+        <w:t>“Use First</w:t>
+      </w:r>
+      <w:r>
+        <w:rPr>
+          <w:rFonts w:eastAsia="DengXian"/>
+          <w:b/>
+          <w:bCs/>
+        </w:rPr>
+        <w:t>, Pay</w:t>
+      </w:r>
+      <w:r>
+        <w:rPr>
+          <w:rFonts w:eastAsia="DengXian"/>
+          <w:b/>
+          <w:bCs/>
+        </w:rPr>
+        <w:t xml:space="preserve"> </w:t>
+      </w:r>
+      <w:r>
+        <w:rPr>
+          <w:rFonts w:eastAsia="DengXian"/>
+          <w:b/>
+          <w:bCs/>
+        </w:rPr>
+        <w:t>Later</w:t>
+      </w:r>
+      <w:r>
+        <w:rPr>
+          <w:rFonts w:eastAsia="DengXian"/>
+          <w:b/>
+          <w:bCs/>
+        </w:rPr>
+        <w:t>”</w:t>
+      </w:r>
+      <w:r>
+        <w:rPr>
+          <w:rFonts w:eastAsia="DengXian"/>
+        </w:rPr>
+        <w:t xml:space="preserve"> </w:t>
+      </w:r>
+      <w:r>
+        <w:rPr>
+          <w:rFonts w:eastAsia="DengXian"/>
+        </w:rPr>
+        <w:t xml:space="preserve">are </w:t>
+      </w:r>
+      <w:r>
+        <w:rPr>
+          <w:rFonts w:eastAsia="DengXian"/>
+        </w:rPr>
+        <w:t xml:space="preserve">two </w:t>
+      </w:r>
+      <w:r>
+        <w:rPr>
+          <w:rFonts w:eastAsia="DengXian"/>
+        </w:rPr>
+        <w:t xml:space="preserve">common business models in everyday life, where there is a time lag between the receipt of cash and the occurrence of services. This creates problems in </w:t>
+      </w:r>
+      <w:r>
+        <w:rPr>
+          <w:rFonts w:eastAsia="DengXian" w:hint="eastAsia"/>
+        </w:rPr>
+        <w:t>managing</w:t>
+      </w:r>
+      <w:r>
+        <w:rPr>
+          <w:rFonts w:eastAsia="DengXian"/>
+        </w:rPr>
+        <w:t xml:space="preserve"> the buyer's </w:t>
+      </w:r>
+      <w:r>
+        <w:rPr>
+          <w:rFonts w:eastAsia="DengXian"/>
+          <w:b/>
+          <w:bCs/>
+        </w:rPr>
+        <w:t>Advance Receipts</w:t>
+      </w:r>
+      <w:r>
+        <w:rPr>
+          <w:rFonts w:eastAsia="DengXian"/>
+        </w:rPr>
+        <w:t xml:space="preserve"> </w:t>
+      </w:r>
+      <w:r>
+        <w:rPr>
+          <w:rFonts w:eastAsia="DengXian"/>
+        </w:rPr>
+        <w:t xml:space="preserve">and the seller's </w:t>
+      </w:r>
+      <w:r>
+        <w:rPr>
+          <w:b/>
+          <w:bCs/>
+          <w:color w:val="1F2328"/>
+          <w:lang w:val="en-CN"/>
+        </w:rPr>
+        <w:t>Accounts Receivable</w:t>
+      </w:r>
+      <w:r>
+        <w:rPr>
+          <w:color w:val="1F2328"/>
+          <w:lang w:val="en-CN"/>
+        </w:rPr>
+        <w:t>,</w:t>
+      </w:r>
+      <w:r>
+        <w:rPr>
+          <w:rFonts w:eastAsia="DengXian"/>
+        </w:rPr>
+        <w:t xml:space="preserve"> </w:t>
+      </w:r>
+      <w:r>
+        <w:rPr>
+          <w:rFonts w:eastAsia="DengXian"/>
+        </w:rPr>
+        <w:t xml:space="preserve">as shown in Figure 1.1. Under the traditional payment system, these problems are based on a plain trust between buyer and seller, which is often not </w:t>
+      </w:r>
+      <w:r>
+        <w:rPr>
+          <w:rFonts w:eastAsia="DengXian"/>
+        </w:rPr>
+        <w:t>sturdy</w:t>
+      </w:r>
+      <w:r>
+        <w:rPr>
+          <w:rFonts w:eastAsia="DengXian"/>
+        </w:rPr>
+        <w:t xml:space="preserve"> </w:t>
+      </w:r>
+      <w:r>
+        <w:rPr>
+          <w:rFonts w:eastAsia="DengXian"/>
+        </w:rPr>
+        <w:t xml:space="preserve">and </w:t>
+      </w:r>
+      <w:r>
+        <w:rPr>
+          <w:rFonts w:eastAsia="DengXian"/>
+          <w:b/>
+          <w:bCs/>
+        </w:rPr>
+        <w:t>runaway</w:t>
+      </w:r>
+      <w:r>
+        <w:rPr>
+          <w:rFonts w:eastAsia="DengXian"/>
+          <w:b/>
+          <w:bCs/>
+        </w:rPr>
+        <w:t>s</w:t>
+      </w:r>
+      <w:r>
+        <w:rPr>
+          <w:rFonts w:eastAsia="DengXian"/>
+        </w:rPr>
+        <w:t xml:space="preserve"> </w:t>
+      </w:r>
+      <w:r>
+        <w:rPr>
+          <w:rFonts w:eastAsia="DengXian" w:hint="eastAsia"/>
+        </w:rPr>
+        <w:t>are</w:t>
+      </w:r>
+      <w:r>
+        <w:rPr>
+          <w:rFonts w:eastAsia="DengXian"/>
+        </w:rPr>
+        <w:t xml:space="preserve"> always occurring.</w:t>
+      </w:r>
+      <w:r>
+        <w:rPr>
+          <w:rFonts w:eastAsia="DengXian"/>
+        </w:rPr>
+        <w:t xml:space="preserve"> </w:t>
+      </w:r>
+      <w:r>
+        <w:rPr>
+          <w:rFonts w:eastAsia="DengXian"/>
+        </w:rPr>
+        <w:t>As shown in Figures 1.2 and 1.3, the number and amount of</w:t>
+      </w:r>
+      <w:r>
+        <w:rPr>
+          <w:rFonts w:eastAsia="DengXian"/>
+        </w:rPr>
+        <w:t xml:space="preserve"> </w:t>
+      </w:r>
+      <w:r>
+        <w:rPr>
+          <w:rFonts w:eastAsia="DengXian"/>
+        </w:rPr>
+        <w:t xml:space="preserve">runaway cases in gyms, coffee shops and milk tea stores, which are represented by rechargeable membership cards, </w:t>
+      </w:r>
+      <w:r>
+        <w:rPr>
+          <w:rFonts w:eastAsia="DengXian"/>
+          <w:b/>
+          <w:bCs/>
+        </w:rPr>
+        <w:t>have been increasing year</w:t>
+      </w:r>
+      <w:r>
+        <w:rPr>
+          <w:rFonts w:eastAsia="DengXian" w:hint="eastAsia"/>
+          <w:b/>
+          <w:bCs/>
+        </w:rPr>
+        <w:t>ly</w:t>
+      </w:r>
+      <w:r>
+        <w:rPr>
+          <w:rFonts w:eastAsia="DengXian"/>
+        </w:rPr>
+        <w:t xml:space="preserve"> in recent </w:t>
+      </w:r>
+      <w:r>
+        <w:rPr>
+          <w:rFonts w:eastAsia="DengXian" w:hint="eastAsia"/>
+        </w:rPr>
+        <w:t>days</w:t>
+      </w:r>
+      <w:r>
+        <w:rPr>
+          <w:rFonts w:eastAsia="DengXian"/>
+        </w:rPr>
+        <w:t>.</w:t>
+      </w:r>
+      <w:r>
+        <w:rPr>
+          <w:rFonts w:eastAsia="DengXian"/>
+        </w:rPr>
+        <w:t xml:space="preserve"> </w:t>
+      </w:r>
+      <w:r>
+        <w:rPr>
+          <w:rFonts w:eastAsia="DengXian" w:hint="eastAsia"/>
+        </w:rPr>
+        <w:t>But</w:t>
+      </w:r>
+      <w:r>
+        <w:rPr>
+          <w:rFonts w:eastAsia="DengXian"/>
+        </w:rPr>
+        <w:t xml:space="preserve"> </w:t>
+      </w:r>
+      <w:r>
+        <w:rPr>
+          <w:rFonts w:eastAsia="DengXian" w:hint="eastAsia"/>
+        </w:rPr>
+        <w:t>t</w:t>
+      </w:r>
+      <w:r>
+        <w:rPr>
+          <w:rFonts w:eastAsia="DengXian"/>
+        </w:rPr>
+        <w:t>he recovery rate of arrears averaged less than 20 percent</w:t>
+      </w:r>
+      <w:r>
+        <w:rPr>
+          <w:rFonts w:eastAsia="DengXian" w:hint="eastAsia"/>
+        </w:rPr>
+        <w:t>!</w:t>
+      </w:r>
+    </w:p>
+    <w:p>
+      <w:pPr>
+        <w:spacing w:line="360" w:lineRule="auto"/>
+        <w:ind w:firstLine="420"/>
+        <w:jc w:val="both"/>
+        <w:rPr>
+          <w:rFonts w:eastAsia="DengXian"/>
+        </w:rPr>
+      </w:pPr>
+      <w:r>
+        <w:rPr>
+          <w:rFonts w:eastAsia="DengXian"/>
+        </w:rPr>
+        <w:t xml:space="preserve">The essential reason for this phenomenon is that under the traditional payment model, the flow of funds is untraceable and can be used arbitrarily. In this semester's course, we gained an in-depth understanding of how smart contracts work. Taking into account the advantages of their </w:t>
+      </w:r>
+      <w:r>
+        <w:rPr>
+          <w:rFonts w:eastAsia="DengXian"/>
+          <w:b/>
+          <w:bCs/>
+        </w:rPr>
+        <w:t>non-</w:t>
+      </w:r>
+      <w:proofErr w:type="spellStart"/>
+      <w:r>
+        <w:rPr>
+          <w:rFonts w:eastAsia="DengXian"/>
+          <w:b/>
+          <w:bCs/>
+        </w:rPr>
+        <w:t>tamperability</w:t>
+      </w:r>
+      <w:proofErr w:type="spellEnd"/>
+      <w:r>
+        <w:rPr>
+          <w:rFonts w:eastAsia="DengXian"/>
+        </w:rPr>
+        <w:t xml:space="preserve">, they can therefore be used to develop management tools for </w:t>
+      </w:r>
+      <w:r>
+        <w:rPr>
+          <w:rFonts w:eastAsia="DengXian" w:hint="eastAsia"/>
+        </w:rPr>
+        <w:t>a</w:t>
+      </w:r>
+      <w:r>
+        <w:rPr>
+          <w:rFonts w:eastAsia="DengXian"/>
+        </w:rPr>
+        <w:t xml:space="preserve">dvance </w:t>
+      </w:r>
+      <w:r>
+        <w:rPr>
+          <w:rFonts w:eastAsia="DengXian" w:hint="eastAsia"/>
+        </w:rPr>
+        <w:t>r</w:t>
+      </w:r>
+      <w:r>
+        <w:rPr>
+          <w:rFonts w:eastAsia="DengXian"/>
+        </w:rPr>
+        <w:t>eceipts</w:t>
+      </w:r>
+      <w:r>
+        <w:rPr>
+          <w:rFonts w:eastAsia="DengXian"/>
+        </w:rPr>
+        <w:t xml:space="preserve"> and </w:t>
+      </w:r>
+      <w:r>
+        <w:rPr>
+          <w:rFonts w:hint="eastAsia"/>
+          <w:color w:val="1F2328"/>
+          <w:lang w:val="en-CN"/>
+        </w:rPr>
+        <w:t>a</w:t>
+      </w:r>
+      <w:r>
+        <w:rPr>
+          <w:color w:val="1F2328"/>
+          <w:lang w:val="en-CN"/>
+        </w:rPr>
+        <w:t xml:space="preserve">ccounts </w:t>
+      </w:r>
+      <w:r>
+        <w:rPr>
+          <w:rFonts w:hint="eastAsia"/>
+          <w:color w:val="1F2328"/>
+          <w:lang w:val="en-CN"/>
+        </w:rPr>
+        <w:t>r</w:t>
+      </w:r>
+      <w:r>
+        <w:rPr>
+          <w:color w:val="1F2328"/>
+          <w:lang w:val="en-CN"/>
+        </w:rPr>
+        <w:t>eceivable</w:t>
+      </w:r>
+      <w:r>
+        <w:rPr>
+          <w:rFonts w:eastAsia="DengXian"/>
+        </w:rPr>
+        <w:t xml:space="preserve"> </w:t>
+      </w:r>
+      <w:r>
+        <w:rPr>
+          <w:rFonts w:eastAsia="DengXian"/>
+        </w:rPr>
+        <w:t xml:space="preserve">that </w:t>
+      </w:r>
+      <w:r>
+        <w:rPr>
+          <w:rFonts w:eastAsia="DengXian" w:hint="eastAsia"/>
+        </w:rPr>
+        <w:t>can</w:t>
+      </w:r>
+      <w:r>
+        <w:rPr>
+          <w:rFonts w:eastAsia="DengXian"/>
+        </w:rPr>
+        <w:t xml:space="preserve"> truly record the flow of </w:t>
+      </w:r>
+      <w:r>
+        <w:rPr>
+          <w:rFonts w:eastAsia="DengXian"/>
+        </w:rPr>
+        <w:t>cash</w:t>
+      </w:r>
+      <w:r>
+        <w:rPr>
+          <w:rFonts w:eastAsia="DengXian"/>
+        </w:rPr>
+        <w:t>, which is the application that will ultimately be presented in this project - Paobuliao.</w:t>
+      </w:r>
+    </w:p>
+    <w:p>
+      <w:pPr>
+        <w:spacing w:line="360" w:lineRule="auto"/>
+        <w:ind w:firstLine="420"/>
+        <w:jc w:val="both"/>
+        <w:rPr>
+          <w:rFonts w:eastAsia="DengXian"/>
+        </w:rPr>
+      </w:pPr>
+      <w:r>
+        <w:rPr>
+          <w:rFonts w:eastAsia="DengXian"/>
+        </w:rPr>
+        <w:t xml:space="preserve">As the project framework in Figure 1.3, we will describe the business </w:t>
+      </w:r>
+      <w:r>
+        <w:rPr>
+          <w:rFonts w:eastAsia="DengXian" w:hint="eastAsia"/>
+        </w:rPr>
+        <w:t>construction</w:t>
+      </w:r>
+      <w:r>
+        <w:rPr>
+          <w:rFonts w:eastAsia="DengXian"/>
+        </w:rPr>
+        <w:t xml:space="preserve"> </w:t>
+      </w:r>
+      <w:r>
+        <w:rPr>
+          <w:rFonts w:eastAsia="DengXian"/>
+        </w:rPr>
+        <w:t xml:space="preserve">in detail in </w:t>
+      </w:r>
+      <w:r>
+        <w:rPr>
+          <w:rFonts w:eastAsia="DengXian"/>
+          <w:b/>
+          <w:bCs/>
+        </w:rPr>
+        <w:t>Part</w:t>
+      </w:r>
+      <w:r>
+        <w:rPr>
+          <w:rFonts w:eastAsia="DengXian"/>
+          <w:b/>
+          <w:bCs/>
+        </w:rPr>
+        <w:t xml:space="preserve"> 2</w:t>
+      </w:r>
+      <w:r>
+        <w:rPr>
+          <w:rFonts w:eastAsia="DengXian"/>
+        </w:rPr>
+        <w:t xml:space="preserve">, </w:t>
+      </w:r>
+      <w:r>
+        <w:rPr>
+          <w:rFonts w:eastAsia="DengXian" w:hint="eastAsia"/>
+        </w:rPr>
+        <w:t>show</w:t>
+      </w:r>
+      <w:r>
+        <w:rPr>
+          <w:rFonts w:eastAsia="DengXian"/>
+        </w:rPr>
+        <w:t xml:space="preserve"> </w:t>
+      </w:r>
+      <w:r>
+        <w:rPr>
+          <w:rFonts w:eastAsia="DengXian"/>
+        </w:rPr>
+        <w:t xml:space="preserve">the technical implementation in </w:t>
+      </w:r>
+      <w:r>
+        <w:rPr>
+          <w:rFonts w:eastAsia="DengXian"/>
+          <w:b/>
+          <w:bCs/>
+        </w:rPr>
+        <w:t>Part</w:t>
+      </w:r>
+      <w:r>
+        <w:rPr>
+          <w:rFonts w:eastAsia="DengXian"/>
+          <w:b/>
+          <w:bCs/>
+        </w:rPr>
+        <w:t xml:space="preserve"> 3</w:t>
+      </w:r>
+      <w:r>
+        <w:rPr>
+          <w:rFonts w:eastAsia="DengXian"/>
+        </w:rPr>
+        <w:t xml:space="preserve">, and </w:t>
+      </w:r>
+      <w:r>
+        <w:rPr>
+          <w:rFonts w:eastAsia="DengXian" w:hint="eastAsia"/>
+        </w:rPr>
+        <w:t>draw</w:t>
+      </w:r>
+      <w:r>
+        <w:rPr>
+          <w:rFonts w:eastAsia="DengXian"/>
+        </w:rPr>
+        <w:t xml:space="preserve"> </w:t>
+      </w:r>
+      <w:r>
+        <w:rPr>
+          <w:rFonts w:eastAsia="DengXian"/>
+        </w:rPr>
+        <w:t xml:space="preserve">a </w:t>
+      </w:r>
+      <w:r>
+        <w:rPr>
+          <w:rFonts w:eastAsia="DengXian"/>
+        </w:rPr>
+        <w:t>c</w:t>
+      </w:r>
+      <w:proofErr w:type="spellStart"/>
+      <w:r>
+        <w:rPr>
+          <w:rFonts w:eastAsia="DengXian"/>
+          <w:lang w:val="en-US"/>
+        </w:rPr>
+        <w:t>onclusion</w:t>
+      </w:r>
+      <w:proofErr w:type="spellEnd"/>
+      <w:r>
+        <w:rPr>
+          <w:rFonts w:eastAsia="DengXian"/>
+          <w:lang w:val="en-US"/>
+        </w:rPr>
+        <w:t xml:space="preserve"> </w:t>
+      </w:r>
+      <w:r>
+        <w:rPr>
+          <w:rFonts w:eastAsia="DengXian"/>
+        </w:rPr>
+        <w:t xml:space="preserve">in </w:t>
+      </w:r>
+      <w:r>
+        <w:rPr>
+          <w:rFonts w:eastAsia="DengXian"/>
+          <w:b/>
+          <w:bCs/>
+        </w:rPr>
+        <w:t>Part</w:t>
+      </w:r>
+      <w:r>
+        <w:rPr>
+          <w:rFonts w:eastAsia="DengXian"/>
+          <w:b/>
+          <w:bCs/>
+        </w:rPr>
+        <w:t xml:space="preserve"> 4</w:t>
+      </w:r>
+      <w:r>
+        <w:rPr>
+          <w:rFonts w:eastAsia="DengXian"/>
+        </w:rPr>
+        <w:t>.</w:t>
+      </w:r>
+    </w:p>
+    <w:p>
+      <w:pPr>
+        <w:spacing w:line="360" w:lineRule="auto"/>
+        <w:ind w:firstLine="420"/>
+        <w:jc w:val="both"/>
+        <w:rPr>
+          <w:rFonts w:eastAsia="DengXian"/>
+        </w:rPr>
+      </w:pPr>
+    </w:p>
+    <w:p>
+      <w:pPr>
+        <w:spacing w:line="360" w:lineRule="auto"/>
+        <w:jc w:val="both"/>
+        <w:rPr>
+          <w:b/>
+          <w:bCs/>
+          <w:sz w:val="28"/>
+          <w:szCs w:val="28"/>
+        </w:rPr>
+      </w:pPr>
+      <w:r>
+        <w:rPr>
+          <w:b/>
+          <w:bCs/>
+          <w:sz w:val="28"/>
+          <w:szCs w:val="28"/>
+        </w:rPr>
+        <w:t>2</w:t>
+      </w:r>
+      <w:r>
+        <w:rPr>
+          <w:b/>
+          <w:bCs/>
+          <w:sz w:val="28"/>
+          <w:szCs w:val="28"/>
+        </w:rPr>
+        <w:t xml:space="preserve">. </w:t>
+      </w:r>
+      <w:r>
+        <w:rPr>
+          <w:b/>
+          <w:bCs/>
+          <w:sz w:val="28"/>
+          <w:szCs w:val="28"/>
+        </w:rPr>
+        <w:t>Business Construction</w:t>
+      </w:r>
+    </w:p>
+    <w:p>
+      <w:pPr>
+        <w:spacing w:line="360" w:lineRule="auto"/>
+        <w:rPr>
+          <w:rFonts w:eastAsia="DengXian"/>
+          <w:lang w:val="en-US"/>
+        </w:rPr>
+      </w:pPr>
+      <w:r>
+        <w:rPr>
+          <w:rFonts w:eastAsia="DengXian"/>
+        </w:rPr>
+        <w:t xml:space="preserve">2.1 </w:t>
+      </w:r>
+      <w:r>
+        <w:rPr>
+          <w:rFonts w:eastAsia="DengXian" w:hint="eastAsia"/>
+        </w:rPr>
+        <w:t>P</w:t>
+      </w:r>
+      <w:r>
+        <w:rPr>
+          <w:rFonts w:eastAsia="DengXian"/>
+          <w:lang w:val="en-US"/>
+        </w:rPr>
+        <w:t>ay First Use Later</w:t>
+      </w:r>
+    </w:p>
+    <w:p>
+      <w:pPr>
+        <w:spacing w:line="360" w:lineRule="auto"/>
+        <w:rPr>
+          <w:rFonts w:eastAsia="DengXian"/>
+          <w:lang w:val="en-US"/>
+        </w:rPr>
+      </w:pPr>
+      <w:r>
+        <w:rPr>
+          <w:rFonts w:eastAsia="DengXian"/>
+          <w:lang w:val="en-US"/>
+        </w:rPr>
+        <w:t>2.2 Use First Pay Later</w:t>
+      </w:r>
+    </w:p>
+    <w:p>
+      <w:pPr>
+        <w:spacing w:line="360" w:lineRule="auto"/>
+        <w:rPr>
+          <w:rFonts w:eastAsia="DengXian"/>
+          <w:lang w:val="en-US"/>
+        </w:rPr>
+      </w:pPr>
+    </w:p>
+    <w:p>
+      <w:pPr>
+        <w:pStyle w:val="Heading1"/>
+        <w:numPr>
+          <w:ilvl w:val="0"/>
+          <w:numId w:val="0"/>
+        </w:numPr>
+        <w:spacing w:before="0" w:beforeAutospacing="0" w:after="0" w:afterAutospacing="0" w:line="360" w:lineRule="auto"/>
+        <w:rPr>
+          <w:sz w:val="28"/>
+          <w:szCs w:val="28"/>
+        </w:rPr>
+      </w:pPr>
+      <w:r>
+        <w:rPr>
+          <w:sz w:val="28"/>
+          <w:szCs w:val="28"/>
+        </w:rPr>
+        <w:t xml:space="preserve">3. </w:t>
+      </w:r>
+      <w:r>
+        <w:rPr>
+          <w:sz w:val="28"/>
+          <w:szCs w:val="28"/>
+        </w:rPr>
+        <w:t>Technical Implementation</w:t>
+      </w:r>
+    </w:p>
+    <w:p>
+      <w:pPr>
+        <w:spacing w:line="360" w:lineRule="auto"/>
+        <w:rPr>
+          <w:rFonts w:eastAsia="DengXian"/>
+          <w:lang w:val="en-US"/>
+        </w:rPr>
+      </w:pPr>
+      <w:r>
+        <w:rPr>
+          <w:rFonts w:eastAsia="DengXian"/>
+          <w:lang w:val="en-US"/>
+        </w:rPr>
+        <w:t xml:space="preserve">3.1 </w:t>
+      </w:r>
+      <w:r>
+        <w:rPr>
+          <w:rFonts w:eastAsia="DengXian"/>
+          <w:lang w:val="en-US"/>
+        </w:rPr>
+        <w:t>I</w:t>
+      </w:r>
+      <w:r>
+        <w:rPr>
+          <w:rFonts w:eastAsia="DengXian"/>
+          <w:lang w:val="en-US"/>
+        </w:rPr>
+        <w:t xml:space="preserve">mplementation </w:t>
+      </w:r>
+      <w:r>
+        <w:rPr>
+          <w:rFonts w:eastAsia="DengXian"/>
+          <w:lang w:val="en-US"/>
+        </w:rPr>
+        <w:t>L</w:t>
+      </w:r>
+      <w:r>
+        <w:rPr>
+          <w:rFonts w:eastAsia="DengXian"/>
+          <w:lang w:val="en-US"/>
+        </w:rPr>
+        <w:t>ogic</w:t>
+      </w:r>
+    </w:p>
+    <w:p>
+      <w:pPr>
+        <w:spacing w:line="360" w:lineRule="auto"/>
+        <w:rPr>
+          <w:rFonts w:eastAsia="DengXian"/>
+        </w:rPr>
+      </w:pPr>
+      <w:r>
+        <w:rPr>
+          <w:rFonts w:eastAsia="DengXian"/>
+        </w:rPr>
+        <w:t xml:space="preserve">3.2 </w:t>
+      </w:r>
+      <w:r>
+        <w:rPr>
+          <w:rFonts w:eastAsia="DengXian"/>
+        </w:rPr>
+        <w:t>Demonstration</w:t>
+      </w:r>
+    </w:p>
+    <w:p>
+      <w:pPr>
+        <w:spacing w:line="360" w:lineRule="auto"/>
+        <w:rPr>
+          <w:rFonts w:eastAsia="DengXian"/>
+        </w:rPr>
+      </w:pPr>
+    </w:p>
+    <w:p>
+      <w:pPr>
+        <w:spacing w:line="360" w:lineRule="auto"/>
+        <w:rPr>
+          <w:rFonts w:eastAsia="DengXian"/>
+          <w:b/>
+          <w:bCs/>
+          <w:sz w:val="28"/>
+          <w:szCs w:val="28"/>
+        </w:rPr>
+      </w:pPr>
+      <w:r>
+        <w:rPr>
+          <w:rFonts w:eastAsia="DengXian"/>
+          <w:b/>
+          <w:bCs/>
+          <w:sz w:val="28"/>
+          <w:szCs w:val="28"/>
+        </w:rPr>
+        <w:t xml:space="preserve">4. </w:t>
+      </w:r>
+      <w:r>
+        <w:rPr>
+          <w:rFonts w:eastAsia="DengXian" w:hint="eastAsia"/>
+          <w:b/>
+          <w:bCs/>
+          <w:sz w:val="28"/>
+          <w:szCs w:val="28"/>
+        </w:rPr>
+        <w:t>Conclusion</w:t>
+      </w:r>
+      <w:r>
+        <w:rPr>
+          <w:rFonts w:eastAsia="DengXian"/>
+          <w:b/>
+          <w:bCs/>
+          <w:sz w:val="28"/>
+          <w:szCs w:val="28"/>
+        </w:rPr>
+        <w:t xml:space="preserve"> &amp; </w:t>
+      </w:r>
+      <w:r>
+        <w:rPr>
+          <w:rFonts w:eastAsia="DengXian" w:hint="eastAsia"/>
+          <w:b/>
+          <w:bCs/>
+          <w:sz w:val="28"/>
+          <w:szCs w:val="28"/>
+        </w:rPr>
+        <w:t>Extension</w:t>
+      </w:r>
+    </w:p>
+    <w:p>
+      <w:pPr>
+        <w:spacing w:line="360" w:lineRule="auto"/>
+        <w:rPr>
+          <w:rFonts w:eastAsia="DengXian"/>
+        </w:rPr>
+      </w:pPr>
+    </w:p>
+    <w:p>
+      <w:pPr>
+        <w:spacing w:line="360" w:lineRule="auto"/>
+        <w:rPr>
+          <w:rFonts w:eastAsia="DengXian"/>
+          <w:b/>
+          <w:bCs/>
+          <w:kern w:val="36"/>
           <w:sz w:val="21"/>
+          <w:szCs w:val="48"/>
+        </w:rPr>
+      </w:pPr>
+      <w:r>
+        <w:rPr>
+          <w:rFonts w:eastAsia="DengXian"/>
+          <w:sz w:val="21"/>
+        </w:rPr>
+        <w:br w:type="page"/>
+      </w:r>
+    </w:p>
+    <w:p>
+      <w:pPr>
+        <w:pStyle w:val="Heading1"/>
+        <w:numPr>
+          <w:ilvl w:val="0"/>
+          <w:numId w:val="0"/>
+        </w:numPr>
+        <w:spacing w:before="0" w:beforeAutospacing="0" w:after="0" w:afterAutospacing="0" w:line="360" w:lineRule="auto"/>
+        <w:rPr>
+          <w:rFonts w:eastAsiaTheme="minorEastAsia"/>
+          <w:sz w:val="28"/>
+          <w:szCs w:val="28"/>
+        </w:rPr>
+      </w:pPr>
+      <w:r>
+        <w:rPr>
+          <w:sz w:val="28"/>
+          <w:szCs w:val="28"/>
+        </w:rPr>
+        <w:lastRenderedPageBreak/>
+        <w:t>Appendix</w:t>
+      </w:r>
+    </w:p>
+    <w:p>
+      <w:pPr>
+        <w:pStyle w:val="Heading1"/>
+        <w:numPr>
+          <w:ilvl w:val="0"/>
+          <w:numId w:val="0"/>
+        </w:numPr>
+        <w:spacing w:before="0" w:beforeAutospacing="0" w:after="0" w:afterAutospacing="0" w:line="360" w:lineRule="auto"/>
+        <w:jc w:val="center"/>
+        <w:rPr>
+          <w:rFonts w:eastAsia="DengXian"/>
+          <w:sz w:val="21"/>
+        </w:rPr>
+      </w:pPr>
+      <w:r>
+        <w:rPr>
+          <w:rFonts w:eastAsia="DengXian"/>
+          <w:sz w:val="21"/>
+        </w:rPr>
+        <w:drawing>
+          <wp:inline distT="0" distB="0" distL="0" distR="0" wp14:anchorId="5BCB2C59" wp14:editId="12A51A34">
+            <wp:extent cx="5451253" cy="2788479"/>
+            <wp:effectExtent l="0" t="0" r="0" b="5715"/>
+            <wp:docPr id="4" name="Picture 3">
+              <a:extLst xmlns:a="http://schemas.openxmlformats.org/drawingml/2006/main">
+                <a:ext uri="{FF2B5EF4-FFF2-40B4-BE49-F238E27FC236}">
+                  <a16:creationId xmlns:a16="http://schemas.microsoft.com/office/drawing/2014/main" id="{82807D3A-CC85-B741-833B-D6AEC7DABF8E}"/>
+                </a:ext>
+              </a:extLst>
+            </wp:docPr>
+            <wp:cNvGraphicFramePr>
+              <a:graphicFrameLocks xmlns:a="http://schemas.openxmlformats.org/drawingml/2006/main" noChangeAspect="1"/>
+            </wp:cNvGraphicFramePr>
+            <a:graphic xmlns:a="http://schemas.openxmlformats.org/drawingml/2006/main">
+              <a:graphicData uri="http://schemas.openxmlformats.org/drawingml/2006/picture">
+                <pic:pic xmlns:pic="http://schemas.openxmlformats.org/drawingml/2006/picture">
+                  <pic:nvPicPr>
+                    <pic:cNvPr id="4" name="Picture 3">
+                      <a:extLst>
+                        <a:ext uri="{FF2B5EF4-FFF2-40B4-BE49-F238E27FC236}">
+                          <a16:creationId xmlns:a16="http://schemas.microsoft.com/office/drawing/2014/main" id="{82807D3A-CC85-B741-833B-D6AEC7DABF8E}"/>
+                        </a:ext>
+                      </a:extLst>
+                    </pic:cNvPr>
+                    <pic:cNvPicPr>
+                      <a:picLocks noChangeAspect="1"/>
+                    </pic:cNvPicPr>
+                  </pic:nvPicPr>
+                  <pic:blipFill>
+                    <a:blip r:embed="rId15"/>
+                    <a:stretch>
+                      <a:fillRect/>
+                    </a:stretch>
+                  </pic:blipFill>
+                  <pic:spPr>
+                    <a:xfrm>
+                      <a:off x="0" y="0"/>
+                      <a:ext cx="5459975" cy="2792940"/>
+                    </a:xfrm>
+                    <a:prstGeom prst="rect">
+                      <a:avLst/>
+                    </a:prstGeom>
+                  </pic:spPr>
+                </pic:pic>
+              </a:graphicData>
+            </a:graphic>
+          </wp:inline>
+        </w:drawing>
+      </w:r>
+    </w:p>
+    <w:p>
+      <w:pPr>
+        <w:pStyle w:val="NoSpacing"/>
+        <w:spacing w:line="360" w:lineRule="auto"/>
+        <w:ind w:firstLine="0"/>
+        <w:jc w:val="center"/>
+        <w:rPr>
+          <w:rFonts w:eastAsia="DengXian"/>
+          <w:sz w:val="21"/>
+          <w:szCs w:val="21"/>
+        </w:rPr>
+      </w:pPr>
+      <w:r>
+        <w:rPr>
+          <w:rFonts w:hint="eastAsia"/>
+          <w:b/>
+          <w:bCs/>
+          <w:sz w:val="21"/>
+          <w:szCs w:val="21"/>
+          <w:lang w:val="en-GB" w:eastAsia="zh-CN"/>
+        </w:rPr>
+        <w:t>Fig</w:t>
+      </w:r>
+      <w:r>
+        <w:rPr>
+          <w:b/>
+          <w:bCs/>
+          <w:sz w:val="21"/>
+          <w:szCs w:val="21"/>
+          <w:lang w:val="en-GB" w:eastAsia="zh-CN"/>
+        </w:rPr>
+        <w:t>ure 1.1</w:t>
+      </w:r>
+      <w:r>
+        <w:rPr>
+          <w:sz w:val="21"/>
+          <w:szCs w:val="21"/>
+          <w:lang w:val="en-GB" w:eastAsia="zh-CN"/>
+        </w:rPr>
+        <w:t xml:space="preserve"> </w:t>
+      </w:r>
+      <w:r>
+        <w:rPr>
+          <w:sz w:val="21"/>
+          <w:szCs w:val="21"/>
+          <w:lang w:val="en-GB" w:eastAsia="zh-CN"/>
+        </w:rPr>
+        <w:t xml:space="preserve">Runaway </w:t>
+      </w:r>
+      <w:r>
+        <w:rPr>
+          <w:sz w:val="21"/>
+          <w:szCs w:val="21"/>
+          <w:lang w:val="en-GB" w:eastAsia="zh-CN"/>
+        </w:rPr>
+        <w:t>d</w:t>
+      </w:r>
+      <w:r>
+        <w:rPr>
+          <w:sz w:val="21"/>
+          <w:szCs w:val="21"/>
+          <w:lang w:val="en-GB" w:eastAsia="zh-CN"/>
+        </w:rPr>
+        <w:t>ilemma</w:t>
+      </w:r>
+      <w:r>
+        <w:rPr>
+          <w:sz w:val="21"/>
+          <w:szCs w:val="21"/>
+          <w:lang w:val="en-GB" w:eastAsia="zh-CN"/>
+        </w:rPr>
+        <w:t xml:space="preserve"> </w:t>
+      </w:r>
+      <w:r>
+        <w:rPr>
+          <w:sz w:val="21"/>
+          <w:szCs w:val="21"/>
+          <w:lang w:val="en-US" w:eastAsia="zh-CN"/>
+        </w:rPr>
+        <w:t>of</w:t>
+      </w:r>
+      <w:r>
+        <w:rPr>
+          <w:sz w:val="21"/>
+          <w:szCs w:val="21"/>
+          <w:lang w:val="en-US" w:eastAsia="zh-CN"/>
+        </w:rPr>
+        <w:t xml:space="preserve"> </w:t>
+      </w:r>
+      <w:r>
+        <w:rPr>
+          <w:rFonts w:eastAsia="DengXian"/>
+          <w:sz w:val="21"/>
+          <w:szCs w:val="21"/>
+        </w:rPr>
+        <w:t xml:space="preserve">“Pay First, </w:t>
+      </w:r>
+      <w:proofErr w:type="spellStart"/>
+      <w:r>
+        <w:rPr>
+          <w:rFonts w:eastAsia="DengXian"/>
+          <w:sz w:val="21"/>
+          <w:szCs w:val="21"/>
+        </w:rPr>
+        <w:t>Use</w:t>
+      </w:r>
+      <w:proofErr w:type="spellEnd"/>
+      <w:r>
+        <w:rPr>
+          <w:rFonts w:eastAsia="DengXian"/>
+          <w:sz w:val="21"/>
+          <w:szCs w:val="21"/>
+        </w:rPr>
+        <w:t xml:space="preserve"> </w:t>
+      </w:r>
+      <w:proofErr w:type="spellStart"/>
+      <w:r>
+        <w:rPr>
+          <w:rFonts w:eastAsia="DengXian"/>
+          <w:sz w:val="21"/>
+          <w:szCs w:val="21"/>
+        </w:rPr>
+        <w:t>Later</w:t>
+      </w:r>
+      <w:proofErr w:type="spellEnd"/>
+      <w:r>
+        <w:rPr>
+          <w:rFonts w:eastAsia="DengXian"/>
+          <w:sz w:val="21"/>
+          <w:szCs w:val="21"/>
+          <w:lang w:val="en-US"/>
+        </w:rPr>
+        <w:t xml:space="preserve">” </w:t>
+      </w:r>
+      <w:r>
+        <w:rPr>
+          <w:rFonts w:eastAsia="DengXian"/>
+          <w:sz w:val="21"/>
+          <w:szCs w:val="21"/>
+        </w:rPr>
+        <w:t>and “</w:t>
+      </w:r>
+      <w:proofErr w:type="spellStart"/>
+      <w:r>
+        <w:rPr>
+          <w:rFonts w:eastAsia="DengXian"/>
+          <w:sz w:val="21"/>
+          <w:szCs w:val="21"/>
+        </w:rPr>
+        <w:t>Use</w:t>
+      </w:r>
+      <w:proofErr w:type="spellEnd"/>
+      <w:r>
+        <w:rPr>
+          <w:rFonts w:eastAsia="DengXian"/>
+          <w:sz w:val="21"/>
+          <w:szCs w:val="21"/>
+        </w:rPr>
+        <w:t xml:space="preserve"> First, Pay </w:t>
+      </w:r>
+      <w:proofErr w:type="spellStart"/>
+      <w:r>
+        <w:rPr>
+          <w:rFonts w:eastAsia="DengXian"/>
+          <w:sz w:val="21"/>
+          <w:szCs w:val="21"/>
+        </w:rPr>
+        <w:t>Later</w:t>
+      </w:r>
+      <w:proofErr w:type="spellEnd"/>
+      <w:r>
+        <w:rPr>
+          <w:rFonts w:eastAsia="DengXian"/>
+          <w:sz w:val="21"/>
+          <w:szCs w:val="21"/>
+        </w:rPr>
+        <w:t>”</w:t>
+      </w:r>
+      <w:r>
+        <w:rPr>
+          <w:rFonts w:eastAsia="DengXian"/>
+          <w:sz w:val="21"/>
+          <w:szCs w:val="21"/>
+        </w:rPr>
+        <w:t xml:space="preserve"> </w:t>
+      </w:r>
+      <w:proofErr w:type="spellStart"/>
+      <w:r>
+        <w:rPr>
+          <w:rFonts w:eastAsia="DengXian"/>
+          <w:sz w:val="21"/>
+          <w:szCs w:val="21"/>
+        </w:rPr>
+        <w:t>bussiness</w:t>
+      </w:r>
+      <w:proofErr w:type="spellEnd"/>
+      <w:r>
+        <w:rPr>
+          <w:rFonts w:eastAsia="DengXian"/>
+          <w:sz w:val="21"/>
+          <w:szCs w:val="21"/>
+        </w:rPr>
+        <w:t xml:space="preserve"> models</w:t>
+      </w:r>
+      <w:r>
+        <w:rPr>
+          <w:rFonts w:eastAsia="DengXian"/>
+          <w:sz w:val="21"/>
+          <w:szCs w:val="21"/>
+        </w:rPr>
+        <w:t>.</w:t>
+      </w:r>
+    </w:p>
+    <w:p>
+      <w:pPr>
+        <w:pStyle w:val="NoSpacing"/>
+        <w:spacing w:line="360" w:lineRule="auto"/>
+        <w:ind w:firstLine="0"/>
+        <w:jc w:val="center"/>
+        <w:rPr>
+          <w:rFonts w:eastAsia="DengXian"/>
+          <w:sz w:val="21"/>
+          <w:szCs w:val="21"/>
+        </w:rPr>
+      </w:pPr>
+    </w:p>
+    <w:p>
+      <w:pPr>
+        <w:pStyle w:val="NoSpacing"/>
+        <w:spacing w:line="360" w:lineRule="auto"/>
+        <w:ind w:firstLine="0"/>
+        <w:jc w:val="center"/>
+        <w:rPr>
+          <w:sz w:val="21"/>
+          <w:szCs w:val="21"/>
+          <w:lang w:val="en-US" w:eastAsia="zh-CN"/>
+        </w:rPr>
+      </w:pPr>
+      <w:r>
+        <w:rPr>
+          <w:noProof/>
+        </w:rPr>
+        <w:drawing>
+          <wp:inline distT="0" distB="0" distL="0" distR="0" wp14:anchorId="6CC80758" wp14:editId="45ADC9EC">
+            <wp:extent cx="4263656" cy="2143414"/>
+            <wp:effectExtent l="0" t="0" r="0" b="0"/>
+            <wp:docPr id="1" name="Picture 1"/>
+            <wp:cNvGraphicFramePr>
+              <a:graphicFrameLocks xmlns:a="http://schemas.openxmlformats.org/drawingml/2006/main" noChangeAspect="1"/>
+            </wp:cNvGraphicFramePr>
+            <a:graphic xmlns:a="http://schemas.openxmlformats.org/drawingml/2006/main">
+              <a:graphicData uri="http://schemas.openxmlformats.org/drawingml/2006/picture">
+                <pic:pic xmlns:pic="http://schemas.openxmlformats.org/drawingml/2006/picture">
+                  <pic:nvPicPr>
+                    <pic:cNvPr id="1" name=""/>
+                    <pic:cNvPicPr/>
+                  </pic:nvPicPr>
+                  <pic:blipFill>
+                    <a:blip r:embed="rId16"/>
+                    <a:stretch>
+                      <a:fillRect/>
+                    </a:stretch>
+                  </pic:blipFill>
+                  <pic:spPr>
+                    <a:xfrm>
+                      <a:off x="0" y="0"/>
+                      <a:ext cx="4335442" cy="2179502"/>
+                    </a:xfrm>
+                    <a:prstGeom prst="rect">
+                      <a:avLst/>
+                    </a:prstGeom>
+                  </pic:spPr>
+                </pic:pic>
+              </a:graphicData>
+            </a:graphic>
+          </wp:inline>
+        </w:drawing>
+      </w:r>
+    </w:p>
+    <w:p>
+      <w:pPr>
+        <w:pStyle w:val="NoSpacing"/>
+        <w:spacing w:line="360" w:lineRule="auto"/>
+        <w:ind w:firstLine="0"/>
+        <w:jc w:val="center"/>
+        <w:rPr>
+          <w:sz w:val="21"/>
+          <w:szCs w:val="21"/>
+          <w:lang w:val="en-US"/>
+        </w:rPr>
+      </w:pPr>
+      <w:r>
+        <w:rPr>
+          <w:b/>
+          <w:bCs/>
+          <w:sz w:val="21"/>
+          <w:szCs w:val="21"/>
+          <w:lang w:val="en-CN"/>
+        </w:rPr>
+        <w:t>Fig 1.</w:t>
+      </w:r>
+      <w:r>
+        <w:rPr>
+          <w:b/>
+          <w:bCs/>
+          <w:sz w:val="21"/>
+          <w:szCs w:val="21"/>
+          <w:lang w:val="en-US"/>
+        </w:rPr>
+        <w:t>2</w:t>
+      </w:r>
+      <w:r>
+        <w:rPr>
+          <w:b/>
+          <w:bCs/>
+          <w:sz w:val="21"/>
+          <w:szCs w:val="21"/>
+          <w:lang w:val="en-CN"/>
+        </w:rPr>
+        <w:t xml:space="preserve"> </w:t>
+      </w:r>
+      <w:r>
+        <w:rPr>
+          <w:sz w:val="21"/>
+          <w:szCs w:val="21"/>
+          <w:lang w:val="en-US"/>
+        </w:rPr>
+        <w:t xml:space="preserve">Statistics on Prepaid </w:t>
+      </w:r>
+      <w:r>
+        <w:rPr>
+          <w:b/>
+          <w:bCs/>
+          <w:sz w:val="21"/>
+          <w:szCs w:val="21"/>
+          <w:lang w:val="en-US"/>
+        </w:rPr>
+        <w:t>GYM</w:t>
+      </w:r>
+      <w:r>
+        <w:rPr>
+          <w:sz w:val="21"/>
+          <w:szCs w:val="21"/>
+          <w:lang w:val="en-US"/>
+        </w:rPr>
+        <w:t xml:space="preserve"> Run Away.</w:t>
+      </w:r>
+    </w:p>
+    <w:p>
+      <w:pPr>
+        <w:pStyle w:val="NoSpacing"/>
+        <w:spacing w:line="360" w:lineRule="auto"/>
+        <w:ind w:firstLine="0"/>
+        <w:jc w:val="center"/>
+        <w:rPr>
+          <w:sz w:val="21"/>
+          <w:szCs w:val="21"/>
+          <w:lang w:val="en-US" w:eastAsia="zh-CN"/>
+        </w:rPr>
+      </w:pPr>
+    </w:p>
+    <w:p>
+      <w:pPr>
+        <w:pStyle w:val="NoSpacing"/>
+        <w:spacing w:line="360" w:lineRule="auto"/>
+        <w:ind w:firstLine="0"/>
+        <w:jc w:val="center"/>
+        <w:rPr>
+          <w:sz w:val="21"/>
+          <w:szCs w:val="21"/>
+          <w:lang w:val="en-US" w:eastAsia="zh-CN"/>
+        </w:rPr>
+      </w:pPr>
+      <w:r>
+        <w:rPr>
+          <w:noProof/>
+        </w:rPr>
+        <w:drawing>
+          <wp:inline distT="0" distB="0" distL="0" distR="0" wp14:anchorId="6AADCC46" wp14:editId="27264F1E">
+            <wp:extent cx="4919626" cy="1895856"/>
+            <wp:effectExtent l="0" t="0" r="0" b="0"/>
+            <wp:docPr id="6" name="Picture 6"/>
+            <wp:cNvGraphicFramePr>
+              <a:graphicFrameLocks xmlns:a="http://schemas.openxmlformats.org/drawingml/2006/main" noChangeAspect="1"/>
+            </wp:cNvGraphicFramePr>
+            <a:graphic xmlns:a="http://schemas.openxmlformats.org/drawingml/2006/main">
+              <a:graphicData uri="http://schemas.openxmlformats.org/drawingml/2006/picture">
+                <pic:pic xmlns:pic="http://schemas.openxmlformats.org/drawingml/2006/picture">
+                  <pic:nvPicPr>
+                    <pic:cNvPr id="1" name=""/>
+                    <pic:cNvPicPr/>
+                  </pic:nvPicPr>
+                  <pic:blipFill>
+                    <a:blip r:embed="rId17"/>
+                    <a:stretch>
+                      <a:fillRect/>
+                    </a:stretch>
+                  </pic:blipFill>
+                  <pic:spPr>
+                    <a:xfrm>
+                      <a:off x="0" y="0"/>
+                      <a:ext cx="4933828" cy="1901329"/>
+                    </a:xfrm>
+                    <a:prstGeom prst="rect">
+                      <a:avLst/>
+                    </a:prstGeom>
+                  </pic:spPr>
+                </pic:pic>
+              </a:graphicData>
+            </a:graphic>
+          </wp:inline>
+        </w:drawing>
+      </w:r>
+    </w:p>
+    <w:p>
+      <w:pPr>
+        <w:pStyle w:val="NoSpacing"/>
+        <w:spacing w:line="360" w:lineRule="auto"/>
+        <w:ind w:firstLine="0"/>
+        <w:jc w:val="center"/>
+        <w:rPr>
+          <w:sz w:val="21"/>
+          <w:szCs w:val="21"/>
+          <w:lang w:val="en-US"/>
+        </w:rPr>
+      </w:pPr>
+      <w:r>
+        <w:rPr>
+          <w:b/>
+          <w:bCs/>
+          <w:sz w:val="21"/>
+          <w:szCs w:val="21"/>
+          <w:lang w:val="en-CN"/>
+        </w:rPr>
+        <w:t>Fig 1.</w:t>
+      </w:r>
+      <w:r>
+        <w:rPr>
+          <w:b/>
+          <w:bCs/>
+          <w:sz w:val="21"/>
+          <w:szCs w:val="21"/>
+          <w:lang w:val="en-US"/>
+        </w:rPr>
+        <w:t>3</w:t>
+      </w:r>
+      <w:r>
+        <w:rPr>
+          <w:b/>
+          <w:bCs/>
+          <w:sz w:val="21"/>
+          <w:szCs w:val="21"/>
+          <w:lang w:val="en-CN"/>
+        </w:rPr>
+        <w:t xml:space="preserve"> </w:t>
+      </w:r>
+      <w:r>
+        <w:rPr>
+          <w:sz w:val="21"/>
+          <w:szCs w:val="21"/>
+          <w:lang w:val="en-US"/>
+        </w:rPr>
+        <w:t xml:space="preserve">Statistics on Prepaid </w:t>
+      </w:r>
+      <w:r>
+        <w:rPr>
+          <w:b/>
+          <w:bCs/>
+          <w:sz w:val="21"/>
+          <w:szCs w:val="21"/>
+          <w:lang w:val="en-US"/>
+        </w:rPr>
+        <w:t>Coffee &amp; Milk Tea Shop</w:t>
+      </w:r>
+      <w:r>
+        <w:rPr>
+          <w:sz w:val="21"/>
+          <w:szCs w:val="21"/>
+          <w:lang w:val="en-US"/>
+        </w:rPr>
+        <w:t xml:space="preserve"> Run Away.</w:t>
+      </w:r>
+    </w:p>
+    <w:p>
+      <w:pPr>
+        <w:pStyle w:val="NoSpacing"/>
+        <w:spacing w:line="360" w:lineRule="auto"/>
+        <w:ind w:firstLine="0"/>
+        <w:jc w:val="center"/>
+        <w:rPr>
+          <w:sz w:val="21"/>
+          <w:szCs w:val="21"/>
+          <w:lang w:val="en-US"/>
+        </w:rPr>
+      </w:pPr>
+    </w:p>
+    <w:p>
+      <w:pPr>
+        <w:pStyle w:val="NoSpacing"/>
+        <w:spacing w:line="360" w:lineRule="auto"/>
+        <w:ind w:firstLine="0"/>
+        <w:jc w:val="center"/>
+        <w:rPr>
+          <w:sz w:val="21"/>
+          <w:szCs w:val="21"/>
+          <w:lang w:val="en-US" w:eastAsia="zh-CN"/>
+        </w:rPr>
+      </w:pPr>
+      <w:r>
+        <w:rPr>
+          <w:sz w:val="21"/>
+          <w:szCs w:val="21"/>
+          <w:lang w:val="en-GB" w:eastAsia="zh-CN"/>
+        </w:rPr>
+        <w:lastRenderedPageBreak/>
+        <w:drawing>
+          <wp:inline distT="0" distB="0" distL="0" distR="0" wp14:anchorId="101B2D36" wp14:editId="35071CAB">
+            <wp:extent cx="4845198" cy="3177848"/>
+            <wp:effectExtent l="0" t="0" r="0" b="0"/>
+            <wp:docPr id="10" name="Picture 9">
+              <a:extLst xmlns:a="http://schemas.openxmlformats.org/drawingml/2006/main">
+                <a:ext uri="{FF2B5EF4-FFF2-40B4-BE49-F238E27FC236}">
+                  <a16:creationId xmlns:a16="http://schemas.microsoft.com/office/drawing/2014/main" id="{8B8B6EDC-CFF9-4941-97A5-BF36DC2BD54E}"/>
+                </a:ext>
+              </a:extLst>
+            </wp:docPr>
+            <wp:cNvGraphicFramePr>
+              <a:graphicFrameLocks xmlns:a="http://schemas.openxmlformats.org/drawingml/2006/main" noChangeAspect="1"/>
+            </wp:cNvGraphicFramePr>
+            <a:graphic xmlns:a="http://schemas.openxmlformats.org/drawingml/2006/main">
+              <a:graphicData uri="http://schemas.openxmlformats.org/drawingml/2006/picture">
+                <pic:pic xmlns:pic="http://schemas.openxmlformats.org/drawingml/2006/picture">
+                  <pic:nvPicPr>
+                    <pic:cNvPr id="10" name="Picture 9">
+                      <a:extLst>
+                        <a:ext uri="{FF2B5EF4-FFF2-40B4-BE49-F238E27FC236}">
+                          <a16:creationId xmlns:a16="http://schemas.microsoft.com/office/drawing/2014/main" id="{8B8B6EDC-CFF9-4941-97A5-BF36DC2BD54E}"/>
+                        </a:ext>
+                      </a:extLst>
+                    </pic:cNvPr>
+                    <pic:cNvPicPr>
+                      <a:picLocks noChangeAspect="1"/>
+                    </pic:cNvPicPr>
+                  </pic:nvPicPr>
+                  <pic:blipFill>
+                    <a:blip r:embed="rId18"/>
+                    <a:stretch>
+                      <a:fillRect/>
+                    </a:stretch>
+                  </pic:blipFill>
+                  <pic:spPr>
+                    <a:xfrm>
+                      <a:off x="0" y="0"/>
+                      <a:ext cx="4852327" cy="3182523"/>
+                    </a:xfrm>
+                    <a:prstGeom prst="rect">
+                      <a:avLst/>
+                    </a:prstGeom>
+                  </pic:spPr>
+                </pic:pic>
+              </a:graphicData>
+            </a:graphic>
+          </wp:inline>
+        </w:drawing>
+      </w:r>
+    </w:p>
+    <w:p>
+      <w:pPr>
+        <w:pStyle w:val="NoSpacing"/>
+        <w:spacing w:line="360" w:lineRule="auto"/>
+        <w:ind w:firstLine="0"/>
+        <w:jc w:val="center"/>
+        <w:rPr>
+          <w:sz w:val="21"/>
+          <w:szCs w:val="21"/>
+          <w:lang w:val="en-US"/>
+        </w:rPr>
+      </w:pPr>
+      <w:r>
+        <w:rPr>
+          <w:b/>
+          <w:bCs/>
+          <w:sz w:val="21"/>
+          <w:szCs w:val="21"/>
+          <w:lang w:val="en-CN"/>
+        </w:rPr>
+        <w:t>Fig 1.</w:t>
+      </w:r>
+      <w:r>
+        <w:rPr>
+          <w:b/>
+          <w:bCs/>
+          <w:sz w:val="21"/>
+          <w:szCs w:val="21"/>
+          <w:lang w:val="en-US"/>
+        </w:rPr>
+        <w:t>4</w:t>
+      </w:r>
+      <w:r>
+        <w:rPr>
+          <w:b/>
+          <w:bCs/>
+          <w:sz w:val="21"/>
+          <w:szCs w:val="21"/>
+          <w:lang w:val="en-CN"/>
+        </w:rPr>
+        <w:t xml:space="preserve"> </w:t>
+      </w:r>
+      <w:r>
+        <w:rPr>
+          <w:rFonts w:hint="eastAsia"/>
+          <w:sz w:val="21"/>
+          <w:szCs w:val="21"/>
+          <w:lang w:val="en-CN" w:eastAsia="zh-CN"/>
+        </w:rPr>
+        <w:t>The</w:t>
+      </w:r>
+      <w:r>
+        <w:rPr>
+          <w:sz w:val="21"/>
+          <w:szCs w:val="21"/>
+          <w:lang w:val="en-CN" w:eastAsia="zh-CN"/>
+        </w:rPr>
+        <w:t xml:space="preserve"> </w:t>
+      </w:r>
+      <w:r>
+        <w:rPr>
+          <w:b/>
+          <w:bCs/>
+          <w:sz w:val="21"/>
+          <w:szCs w:val="21"/>
+          <w:lang w:val="en-US" w:eastAsia="zh-CN"/>
+        </w:rPr>
+        <w:t>f</w:t>
+      </w:r>
+      <w:r>
+        <w:rPr>
+          <w:b/>
+          <w:bCs/>
+          <w:sz w:val="21"/>
+          <w:szCs w:val="21"/>
+          <w:lang w:val="en-US" w:eastAsia="zh-CN"/>
+        </w:rPr>
+        <w:t>ramework</w:t>
+      </w:r>
+      <w:r>
+        <w:rPr>
+          <w:sz w:val="21"/>
+          <w:szCs w:val="21"/>
+          <w:lang w:val="en-US" w:eastAsia="zh-CN"/>
+        </w:rPr>
+        <w:t xml:space="preserve"> of our project.</w:t>
+      </w:r>
+    </w:p>
+    <w:p>
+      <w:pPr>
+        <w:pStyle w:val="NoSpacing"/>
+        <w:spacing w:line="360" w:lineRule="auto"/>
+        <w:ind w:firstLine="0"/>
+        <w:jc w:val="center"/>
+        <w:rPr>
+          <w:rFonts w:hint="eastAsia"/>
+          <w:sz w:val="21"/>
+          <w:szCs w:val="21"/>
+          <w:lang w:val="en-US" w:eastAsia="zh-CN"/>
         </w:rPr>
       </w:pPr>
     </w:p>

</xml_diff>